<commit_message>
Update Lab 2 report wording
</commit_message>
<xml_diff>
--- a/Lab-2/Lab2_Report.docx
+++ b/Lab-2/Lab2_Report.docx
@@ -35,7 +35,7 @@
     </w:p>
     <w:p>
       <w:r>
-        <w:t>The smart-classroom agent receives temperature in Celsius and a Boolean occupancy percept. It chooses ECO for an empty room, COOL above 26°C, WARM below 20°C and IDLE otherwise. The stateful extension stores the previous target mode and sends a command only when the target changes. No physical actuator is connected.</w:t>
+        <w:t>My classroom agent takes temperature in Celsius and whether the room is occupied. It chooses ECO for an empty room, COOL above 26°C, WARM below 20°C and IDLE otherwise. The stateful extension stores the previous target mode and sends a command only when the target changes. No physical actuator is connected.</w:t>
       </w:r>
     </w:p>
     <w:p>
@@ -513,7 +513,7 @@
     </w:p>
     <w:p>
       <w:r>
-        <w:t>A reflex agent would return COOL twice for repeated (29, True). The stateful agent returns COOL once, then NO_COMMAND on the repeated percept. At exactly 20°C and 26°C, the strict inequalities produce IDLE. Occupancy has priority, so (29, False) produces ECO.</w:t>
+        <w:t>The reflex version returns COOL again when it sees (29, True) twice. The stateful agent returns COOL once, then NO_COMMAND on the repeated percept. At exactly 20°C and 26°C, the strict inequalities produce IDLE. Occupancy has priority, so (29, False) produces ECO.</w:t>
       </w:r>
     </w:p>
     <w:p>
@@ -649,6 +649,13 @@
       </w:pPr>
       <w:r>
         <w:t>Russell &amp; Norvig, Artificial Intelligence: A Modern Approach, 4th ed., agent and environment framework: https://aima.cs.berkeley.edu/</w:t>
+      </w:r>
+    </w:p>
+    <w:p>
+      <w:r>
+        <w:br/>
+        <w:br/>
+        <w:t>Personal run note: I ran the percept trace and the check file. The repeated COOL command was suppressed, while changes at 26°C and the empty-room case produced new commands as expected.</w:t>
       </w:r>
     </w:p>
     <w:sectPr>

</xml_diff>